<commit_message>
Default new Regime Change
</commit_message>
<xml_diff>
--- a/newform.docx
+++ b/newform.docx
@@ -1034,7 +1034,7 @@
         </w:trPr>
         <w:tc>
           <w:tcPr>
-            <w:tcW w:w="5524" w:type="dxa"/>
+            <w:tcW w:w="5344" w:type="dxa"/>
             <w:tcBorders>
               <w:top w:val="single" w:sz="4" w:space="0" w:color="auto"/>
               <w:left w:val="single" w:sz="4" w:space="0" w:color="auto"/>
@@ -1057,31 +1057,21 @@
                 <w:sz w:val="16"/>
                 <w:szCs w:val="16"/>
               </w:rPr>
-              <w:t>(a) Basic/</w:t>
-            </w:r>
-            <w:proofErr w:type="spellStart"/>
-            <w:r>
-              <w:rPr>
-                <w:rFonts w:asciiTheme="minorHAnsi" w:hAnsiTheme="minorHAnsi" w:cstheme="minorHAnsi"/>
-                <w:sz w:val="16"/>
-                <w:szCs w:val="16"/>
-              </w:rPr>
-              <w:t>Spl</w:t>
-            </w:r>
-            <w:proofErr w:type="spellEnd"/>
-            <w:r>
-              <w:rPr>
-                <w:rFonts w:asciiTheme="minorHAnsi" w:hAnsiTheme="minorHAnsi" w:cstheme="minorHAnsi"/>
-                <w:sz w:val="16"/>
-                <w:szCs w:val="16"/>
-              </w:rPr>
-              <w:t>. Pay</w:t>
+              <w:t xml:space="preserve">(a) </w:t>
+            </w:r>
+            <w:r>
+              <w:rPr>
+                <w:rFonts w:asciiTheme="minorHAnsi" w:hAnsiTheme="minorHAnsi" w:cstheme="minorHAnsi"/>
+                <w:sz w:val="16"/>
+                <w:szCs w:val="16"/>
+              </w:rPr>
+              <w:t>Gross Salary</w:t>
             </w:r>
           </w:p>
         </w:tc>
         <w:tc>
           <w:tcPr>
-            <w:tcW w:w="3780" w:type="dxa"/>
+            <w:tcW w:w="3675" w:type="dxa"/>
             <w:tcBorders>
               <w:top w:val="single" w:sz="4" w:space="0" w:color="auto"/>
               <w:left w:val="single" w:sz="4" w:space="0" w:color="auto"/>
@@ -1122,18 +1112,26 @@
                 <w:sz w:val="16"/>
                 <w:szCs w:val="16"/>
               </w:rPr>
-              <w:t>}}</w:t>
+              <w:t>}</w:t>
+            </w:r>
+            <w:r>
+              <w:rPr>
+                <w:rFonts w:asciiTheme="minorHAnsi" w:hAnsiTheme="minorHAnsi" w:cstheme="minorHAnsi"/>
+                <w:sz w:val="16"/>
+                <w:szCs w:val="16"/>
+              </w:rPr>
+              <w:t>}</w:t>
             </w:r>
           </w:p>
         </w:tc>
       </w:tr>
       <w:tr>
         <w:trPr>
-          <w:trHeight w:val="290"/>
+          <w:trHeight w:val="278"/>
         </w:trPr>
         <w:tc>
           <w:tcPr>
-            <w:tcW w:w="5524" w:type="dxa"/>
+            <w:tcW w:w="5344" w:type="dxa"/>
             <w:tcBorders>
               <w:top w:val="single" w:sz="4" w:space="0" w:color="auto"/>
               <w:left w:val="single" w:sz="4" w:space="0" w:color="auto"/>
@@ -1156,13 +1154,29 @@
                 <w:sz w:val="16"/>
                 <w:szCs w:val="16"/>
               </w:rPr>
-              <w:t>(b) A.G.P.</w:t>
+              <w:t>(</w:t>
+            </w:r>
+            <w:r>
+              <w:rPr>
+                <w:rFonts w:asciiTheme="minorHAnsi" w:hAnsiTheme="minorHAnsi" w:cstheme="minorHAnsi"/>
+                <w:sz w:val="16"/>
+                <w:szCs w:val="16"/>
+              </w:rPr>
+              <w:t>b</w:t>
+            </w:r>
+            <w:r>
+              <w:rPr>
+                <w:rFonts w:asciiTheme="minorHAnsi" w:hAnsiTheme="minorHAnsi" w:cstheme="minorHAnsi"/>
+                <w:sz w:val="16"/>
+                <w:szCs w:val="16"/>
+              </w:rPr>
+              <w:t>) Arrears, if any</w:t>
             </w:r>
           </w:p>
         </w:tc>
         <w:tc>
           <w:tcPr>
-            <w:tcW w:w="3780" w:type="dxa"/>
+            <w:tcW w:w="3675" w:type="dxa"/>
             <w:tcBorders>
               <w:top w:val="single" w:sz="4" w:space="0" w:color="auto"/>
               <w:left w:val="single" w:sz="4" w:space="0" w:color="auto"/>
@@ -1185,36 +1199,18 @@
                 <w:sz w:val="16"/>
                 <w:szCs w:val="16"/>
               </w:rPr>
-              <w:t>{{</w:t>
-            </w:r>
-            <w:proofErr w:type="spellStart"/>
-            <w:r>
-              <w:rPr>
-                <w:rFonts w:asciiTheme="minorHAnsi" w:hAnsiTheme="minorHAnsi" w:cstheme="minorHAnsi"/>
-                <w:sz w:val="16"/>
-                <w:szCs w:val="16"/>
-              </w:rPr>
-              <w:t>agp</w:t>
-            </w:r>
-            <w:proofErr w:type="spellEnd"/>
-            <w:r>
-              <w:rPr>
-                <w:rFonts w:asciiTheme="minorHAnsi" w:hAnsiTheme="minorHAnsi" w:cstheme="minorHAnsi"/>
-                <w:sz w:val="16"/>
-                <w:szCs w:val="16"/>
-              </w:rPr>
-              <w:t>}}</w:t>
+              <w:t>{{arrear}}</w:t>
             </w:r>
           </w:p>
         </w:tc>
       </w:tr>
       <w:tr>
         <w:trPr>
-          <w:trHeight w:val="278"/>
+          <w:trHeight w:val="312"/>
         </w:trPr>
         <w:tc>
           <w:tcPr>
-            <w:tcW w:w="5524" w:type="dxa"/>
+            <w:tcW w:w="5344" w:type="dxa"/>
             <w:tcBorders>
               <w:top w:val="single" w:sz="4" w:space="0" w:color="auto"/>
               <w:left w:val="single" w:sz="4" w:space="0" w:color="auto"/>
@@ -1227,6 +1223,8 @@
             <w:pPr>
               <w:rPr>
                 <w:rFonts w:asciiTheme="minorHAnsi" w:hAnsiTheme="minorHAnsi" w:cstheme="minorHAnsi"/>
+                <w:b/>
+                <w:bCs/>
                 <w:sz w:val="16"/>
                 <w:szCs w:val="16"/>
               </w:rPr>
@@ -1234,16 +1232,38 @@
             <w:r>
               <w:rPr>
                 <w:rFonts w:asciiTheme="minorHAnsi" w:hAnsiTheme="minorHAnsi" w:cstheme="minorHAnsi"/>
-                <w:sz w:val="16"/>
-                <w:szCs w:val="16"/>
-              </w:rPr>
-              <w:t>(c) Dearness Allowance</w:t>
+                <w:b/>
+                <w:bCs/>
+                <w:sz w:val="16"/>
+                <w:szCs w:val="16"/>
+              </w:rPr>
+              <w:t>Total (A</w:t>
+            </w:r>
+            <w:r>
+              <w:rPr>
+                <w:rFonts w:asciiTheme="minorHAnsi" w:hAnsiTheme="minorHAnsi" w:cstheme="minorHAnsi"/>
+                <w:b/>
+                <w:bCs/>
+                <w:sz w:val="16"/>
+                <w:szCs w:val="16"/>
+              </w:rPr>
+              <w:t>+B</w:t>
+            </w:r>
+            <w:r>
+              <w:rPr>
+                <w:rFonts w:asciiTheme="minorHAnsi" w:hAnsiTheme="minorHAnsi" w:cstheme="minorHAnsi"/>
+                <w:b/>
+                <w:bCs/>
+                <w:sz w:val="16"/>
+                <w:szCs w:val="16"/>
+              </w:rPr>
+              <w:t>)</w:t>
             </w:r>
           </w:p>
         </w:tc>
         <w:tc>
           <w:tcPr>
-            <w:tcW w:w="3780" w:type="dxa"/>
+            <w:tcW w:w="3675" w:type="dxa"/>
             <w:tcBorders>
               <w:top w:val="single" w:sz="4" w:space="0" w:color="auto"/>
               <w:left w:val="single" w:sz="4" w:space="0" w:color="auto"/>
@@ -1256,6 +1276,8 @@
             <w:pPr>
               <w:rPr>
                 <w:rFonts w:asciiTheme="minorHAnsi" w:hAnsiTheme="minorHAnsi" w:cstheme="minorHAnsi"/>
+                <w:b/>
+                <w:bCs/>
                 <w:sz w:val="16"/>
                 <w:szCs w:val="16"/>
               </w:rPr>
@@ -1263,69 +1285,8 @@
             <w:r>
               <w:rPr>
                 <w:rFonts w:asciiTheme="minorHAnsi" w:hAnsiTheme="minorHAnsi" w:cstheme="minorHAnsi"/>
-                <w:sz w:val="16"/>
-                <w:szCs w:val="16"/>
-              </w:rPr>
-              <w:t>{{da}}</w:t>
-            </w:r>
-          </w:p>
-        </w:tc>
-      </w:tr>
-      <w:tr>
-        <w:trPr>
-          <w:trHeight w:val="290"/>
-        </w:trPr>
-        <w:tc>
-          <w:tcPr>
-            <w:tcW w:w="5524" w:type="dxa"/>
-            <w:tcBorders>
-              <w:top w:val="single" w:sz="4" w:space="0" w:color="auto"/>
-              <w:left w:val="single" w:sz="4" w:space="0" w:color="auto"/>
-              <w:bottom w:val="single" w:sz="4" w:space="0" w:color="auto"/>
-              <w:right w:val="single" w:sz="4" w:space="0" w:color="auto"/>
-            </w:tcBorders>
-            <w:hideMark/>
-          </w:tcPr>
-          <w:p>
-            <w:pPr>
-              <w:rPr>
-                <w:rFonts w:asciiTheme="minorHAnsi" w:hAnsiTheme="minorHAnsi" w:cstheme="minorHAnsi"/>
-                <w:sz w:val="16"/>
-                <w:szCs w:val="16"/>
-              </w:rPr>
-            </w:pPr>
-            <w:r>
-              <w:rPr>
-                <w:rFonts w:asciiTheme="minorHAnsi" w:hAnsiTheme="minorHAnsi" w:cstheme="minorHAnsi"/>
-                <w:sz w:val="16"/>
-                <w:szCs w:val="16"/>
-              </w:rPr>
-              <w:t>(d) H.R.A.</w:t>
-            </w:r>
-          </w:p>
-        </w:tc>
-        <w:tc>
-          <w:tcPr>
-            <w:tcW w:w="3780" w:type="dxa"/>
-            <w:tcBorders>
-              <w:top w:val="single" w:sz="4" w:space="0" w:color="auto"/>
-              <w:left w:val="single" w:sz="4" w:space="0" w:color="auto"/>
-              <w:bottom w:val="single" w:sz="4" w:space="0" w:color="auto"/>
-              <w:right w:val="single" w:sz="4" w:space="0" w:color="auto"/>
-            </w:tcBorders>
-            <w:hideMark/>
-          </w:tcPr>
-          <w:p>
-            <w:pPr>
-              <w:rPr>
-                <w:rFonts w:asciiTheme="minorHAnsi" w:hAnsiTheme="minorHAnsi" w:cstheme="minorHAnsi"/>
-                <w:sz w:val="16"/>
-                <w:szCs w:val="16"/>
-              </w:rPr>
-            </w:pPr>
-            <w:r>
-              <w:rPr>
-                <w:rFonts w:asciiTheme="minorHAnsi" w:hAnsiTheme="minorHAnsi" w:cstheme="minorHAnsi"/>
+                <w:b/>
+                <w:bCs/>
                 <w:sz w:val="16"/>
                 <w:szCs w:val="16"/>
               </w:rPr>
@@ -1335,227 +1296,22 @@
             <w:r>
               <w:rPr>
                 <w:rFonts w:asciiTheme="minorHAnsi" w:hAnsiTheme="minorHAnsi" w:cstheme="minorHAnsi"/>
-                <w:sz w:val="16"/>
-                <w:szCs w:val="16"/>
-              </w:rPr>
-              <w:t>hra</w:t>
-            </w:r>
-            <w:proofErr w:type="spellEnd"/>
-            <w:r>
-              <w:rPr>
-                <w:rFonts w:asciiTheme="minorHAnsi" w:hAnsiTheme="minorHAnsi" w:cstheme="minorHAnsi"/>
-                <w:sz w:val="16"/>
-                <w:szCs w:val="16"/>
-              </w:rPr>
-              <w:t>}}</w:t>
-            </w:r>
-          </w:p>
-        </w:tc>
-      </w:tr>
-      <w:tr>
-        <w:trPr>
-          <w:trHeight w:val="278"/>
-        </w:trPr>
-        <w:tc>
-          <w:tcPr>
-            <w:tcW w:w="5524" w:type="dxa"/>
-            <w:tcBorders>
-              <w:top w:val="single" w:sz="4" w:space="0" w:color="auto"/>
-              <w:left w:val="single" w:sz="4" w:space="0" w:color="auto"/>
-              <w:bottom w:val="single" w:sz="4" w:space="0" w:color="auto"/>
-              <w:right w:val="single" w:sz="4" w:space="0" w:color="auto"/>
-            </w:tcBorders>
-            <w:hideMark/>
-          </w:tcPr>
-          <w:p>
-            <w:pPr>
-              <w:rPr>
-                <w:rFonts w:asciiTheme="minorHAnsi" w:hAnsiTheme="minorHAnsi" w:cstheme="minorHAnsi"/>
-                <w:sz w:val="16"/>
-                <w:szCs w:val="16"/>
-              </w:rPr>
-            </w:pPr>
-            <w:r>
-              <w:rPr>
-                <w:rFonts w:asciiTheme="minorHAnsi" w:hAnsiTheme="minorHAnsi" w:cstheme="minorHAnsi"/>
-                <w:sz w:val="16"/>
-                <w:szCs w:val="16"/>
-              </w:rPr>
-              <w:t>(e) Other</w:t>
-            </w:r>
-          </w:p>
-        </w:tc>
-        <w:tc>
-          <w:tcPr>
-            <w:tcW w:w="3780" w:type="dxa"/>
-            <w:tcBorders>
-              <w:top w:val="single" w:sz="4" w:space="0" w:color="auto"/>
-              <w:left w:val="single" w:sz="4" w:space="0" w:color="auto"/>
-              <w:bottom w:val="single" w:sz="4" w:space="0" w:color="auto"/>
-              <w:right w:val="single" w:sz="4" w:space="0" w:color="auto"/>
-            </w:tcBorders>
-            <w:hideMark/>
-          </w:tcPr>
-          <w:p>
-            <w:pPr>
-              <w:rPr>
-                <w:rFonts w:asciiTheme="minorHAnsi" w:hAnsiTheme="minorHAnsi" w:cstheme="minorHAnsi"/>
-                <w:sz w:val="16"/>
-                <w:szCs w:val="16"/>
-              </w:rPr>
-            </w:pPr>
-            <w:r>
-              <w:rPr>
-                <w:rFonts w:asciiTheme="minorHAnsi" w:hAnsiTheme="minorHAnsi" w:cstheme="minorHAnsi"/>
-                <w:sz w:val="16"/>
-                <w:szCs w:val="16"/>
-              </w:rPr>
-              <w:t>{{others}}</w:t>
-            </w:r>
-          </w:p>
-        </w:tc>
-      </w:tr>
-      <w:tr>
-        <w:trPr>
-          <w:trHeight w:val="278"/>
-        </w:trPr>
-        <w:tc>
-          <w:tcPr>
-            <w:tcW w:w="5524" w:type="dxa"/>
-            <w:tcBorders>
-              <w:top w:val="single" w:sz="4" w:space="0" w:color="auto"/>
-              <w:left w:val="single" w:sz="4" w:space="0" w:color="auto"/>
-              <w:bottom w:val="single" w:sz="4" w:space="0" w:color="auto"/>
-              <w:right w:val="single" w:sz="4" w:space="0" w:color="auto"/>
-            </w:tcBorders>
-            <w:hideMark/>
-          </w:tcPr>
-          <w:p>
-            <w:pPr>
-              <w:rPr>
-                <w:rFonts w:asciiTheme="minorHAnsi" w:hAnsiTheme="minorHAnsi" w:cstheme="minorHAnsi"/>
-                <w:sz w:val="16"/>
-                <w:szCs w:val="16"/>
-              </w:rPr>
-            </w:pPr>
-            <w:r>
-              <w:rPr>
-                <w:rFonts w:asciiTheme="minorHAnsi" w:hAnsiTheme="minorHAnsi" w:cstheme="minorHAnsi"/>
-                <w:sz w:val="16"/>
-                <w:szCs w:val="16"/>
-              </w:rPr>
-              <w:t>(f) Arrears, if any</w:t>
-            </w:r>
-          </w:p>
-        </w:tc>
-        <w:tc>
-          <w:tcPr>
-            <w:tcW w:w="3780" w:type="dxa"/>
-            <w:tcBorders>
-              <w:top w:val="single" w:sz="4" w:space="0" w:color="auto"/>
-              <w:left w:val="single" w:sz="4" w:space="0" w:color="auto"/>
-              <w:bottom w:val="single" w:sz="4" w:space="0" w:color="auto"/>
-              <w:right w:val="single" w:sz="4" w:space="0" w:color="auto"/>
-            </w:tcBorders>
-            <w:hideMark/>
-          </w:tcPr>
-          <w:p>
-            <w:pPr>
-              <w:rPr>
-                <w:rFonts w:asciiTheme="minorHAnsi" w:hAnsiTheme="minorHAnsi" w:cstheme="minorHAnsi"/>
-                <w:sz w:val="16"/>
-                <w:szCs w:val="16"/>
-              </w:rPr>
-            </w:pPr>
-            <w:r>
-              <w:rPr>
-                <w:rFonts w:asciiTheme="minorHAnsi" w:hAnsiTheme="minorHAnsi" w:cstheme="minorHAnsi"/>
-                <w:sz w:val="16"/>
-                <w:szCs w:val="16"/>
-              </w:rPr>
-              <w:t>{{arrear}}</w:t>
-            </w:r>
-          </w:p>
-        </w:tc>
-      </w:tr>
-      <w:tr>
-        <w:trPr>
-          <w:trHeight w:val="312"/>
-        </w:trPr>
-        <w:tc>
-          <w:tcPr>
-            <w:tcW w:w="5524" w:type="dxa"/>
-            <w:tcBorders>
-              <w:top w:val="single" w:sz="4" w:space="0" w:color="auto"/>
-              <w:left w:val="single" w:sz="4" w:space="0" w:color="auto"/>
-              <w:bottom w:val="single" w:sz="4" w:space="0" w:color="auto"/>
-              <w:right w:val="single" w:sz="4" w:space="0" w:color="auto"/>
-            </w:tcBorders>
-            <w:hideMark/>
-          </w:tcPr>
-          <w:p>
-            <w:pPr>
-              <w:rPr>
-                <w:rFonts w:asciiTheme="minorHAnsi" w:hAnsiTheme="minorHAnsi" w:cstheme="minorHAnsi"/>
-                <w:b/>
-                <w:bCs/>
-                <w:sz w:val="16"/>
-                <w:szCs w:val="16"/>
-              </w:rPr>
-            </w:pPr>
-            <w:r>
-              <w:rPr>
-                <w:rFonts w:asciiTheme="minorHAnsi" w:hAnsiTheme="minorHAnsi" w:cstheme="minorHAnsi"/>
-                <w:b/>
-                <w:bCs/>
-                <w:sz w:val="16"/>
-                <w:szCs w:val="16"/>
-              </w:rPr>
-              <w:t>Total (A to F)</w:t>
-            </w:r>
-          </w:p>
-        </w:tc>
-        <w:tc>
-          <w:tcPr>
-            <w:tcW w:w="3780" w:type="dxa"/>
-            <w:tcBorders>
-              <w:top w:val="single" w:sz="4" w:space="0" w:color="auto"/>
-              <w:left w:val="single" w:sz="4" w:space="0" w:color="auto"/>
-              <w:bottom w:val="single" w:sz="4" w:space="0" w:color="auto"/>
-              <w:right w:val="single" w:sz="4" w:space="0" w:color="auto"/>
-            </w:tcBorders>
-            <w:hideMark/>
-          </w:tcPr>
-          <w:p>
-            <w:pPr>
-              <w:rPr>
-                <w:rFonts w:asciiTheme="minorHAnsi" w:hAnsiTheme="minorHAnsi" w:cstheme="minorHAnsi"/>
-                <w:b/>
-                <w:bCs/>
-                <w:sz w:val="16"/>
-                <w:szCs w:val="16"/>
-              </w:rPr>
-            </w:pPr>
-            <w:r>
-              <w:rPr>
-                <w:rFonts w:asciiTheme="minorHAnsi" w:hAnsiTheme="minorHAnsi" w:cstheme="minorHAnsi"/>
-                <w:b/>
-                <w:bCs/>
-                <w:sz w:val="16"/>
-                <w:szCs w:val="16"/>
-              </w:rPr>
-              <w:t>{{</w:t>
-            </w:r>
-            <w:proofErr w:type="spellStart"/>
-            <w:r>
-              <w:rPr>
-                <w:rFonts w:asciiTheme="minorHAnsi" w:hAnsiTheme="minorHAnsi" w:cstheme="minorHAnsi"/>
-                <w:b/>
-                <w:bCs/>
-                <w:sz w:val="16"/>
-                <w:szCs w:val="16"/>
-              </w:rPr>
-              <w:t>totalAtoF</w:t>
+                <w:b/>
+                <w:bCs/>
+                <w:sz w:val="16"/>
+                <w:szCs w:val="16"/>
+              </w:rPr>
+              <w:t>totalAto</w:t>
+            </w:r>
+            <w:r>
+              <w:rPr>
+                <w:rFonts w:asciiTheme="minorHAnsi" w:hAnsiTheme="minorHAnsi" w:cstheme="minorHAnsi"/>
+                <w:b/>
+                <w:bCs/>
+                <w:sz w:val="16"/>
+                <w:szCs w:val="16"/>
+              </w:rPr>
+              <w:t>F</w:t>
             </w:r>
             <w:proofErr w:type="spellEnd"/>
             <w:r>
@@ -1796,7 +1552,50 @@
           <w:sz w:val="16"/>
           <w:szCs w:val="16"/>
         </w:rPr>
-        <w:t xml:space="preserve">             </w:t>
+        <w:t xml:space="preserve">       </w:t>
+      </w:r>
+      <w:proofErr w:type="gramStart"/>
+      <w:r>
+        <w:rPr>
+          <w:rFonts w:asciiTheme="minorHAnsi" w:hAnsiTheme="minorHAnsi" w:cstheme="minorHAnsi"/>
+          <w:sz w:val="16"/>
+          <w:szCs w:val="16"/>
+        </w:rPr>
+        <w:t xml:space="preserve">   </w:t>
+      </w:r>
+      <w:r>
+        <w:rPr>
+          <w:rFonts w:asciiTheme="minorHAnsi" w:hAnsiTheme="minorHAnsi" w:cstheme="minorHAnsi"/>
+          <w:sz w:val="16"/>
+          <w:szCs w:val="16"/>
+        </w:rPr>
+        <w:t>[a</w:t>
+      </w:r>
+      <w:proofErr w:type="gramEnd"/>
+      <w:r>
+        <w:rPr>
+          <w:rFonts w:asciiTheme="minorHAnsi" w:hAnsiTheme="minorHAnsi" w:cstheme="minorHAnsi"/>
+          <w:sz w:val="16"/>
+          <w:szCs w:val="16"/>
+        </w:rPr>
+        <w:t xml:space="preserve">] </w:t>
+      </w:r>
+      <w:proofErr w:type="gramStart"/>
+      <w:r>
+        <w:rPr>
+          <w:rFonts w:asciiTheme="minorHAnsi" w:hAnsiTheme="minorHAnsi" w:cstheme="minorHAnsi"/>
+          <w:sz w:val="16"/>
+          <w:szCs w:val="16"/>
+        </w:rPr>
+        <w:t>Less</w:t>
+      </w:r>
+      <w:r>
+        <w:rPr>
+          <w:rFonts w:asciiTheme="minorHAnsi" w:hAnsiTheme="minorHAnsi" w:cstheme="minorHAnsi"/>
+          <w:sz w:val="16"/>
+          <w:szCs w:val="16"/>
+        </w:rPr>
+        <w:t xml:space="preserve">  </w:t>
       </w:r>
       <w:r>
         <w:rPr>
@@ -1806,6 +1605,7 @@
         </w:rPr>
         <w:t>Standard</w:t>
       </w:r>
+      <w:proofErr w:type="gramEnd"/>
       <w:r>
         <w:rPr>
           <w:rFonts w:asciiTheme="minorHAnsi" w:hAnsiTheme="minorHAnsi" w:cstheme="minorHAnsi"/>
@@ -2411,7 +2211,6 @@
               <w:bottom w:val="single" w:sz="4" w:space="0" w:color="auto"/>
               <w:right w:val="single" w:sz="4" w:space="0" w:color="auto"/>
             </w:tcBorders>
-            <w:shd w:val="clear" w:color="auto" w:fill="auto"/>
             <w:vAlign w:val="center"/>
             <w:hideMark/>
           </w:tcPr>
@@ -2454,7 +2253,25 @@
                 <w:szCs w:val="16"/>
                 <w:lang w:val="en-GB" w:eastAsia="en-GB"/>
               </w:rPr>
-              <w:t xml:space="preserve"> Rs.300000, 0%</w:t>
+              <w:t xml:space="preserve"> Rs.</w:t>
+            </w:r>
+            <w:r>
+              <w:rPr>
+                <w:rFonts w:eastAsia="Times New Roman"/>
+                <w:sz w:val="16"/>
+                <w:szCs w:val="16"/>
+                <w:lang w:val="en-GB" w:eastAsia="en-GB"/>
+              </w:rPr>
+              <w:t>4</w:t>
+            </w:r>
+            <w:r>
+              <w:rPr>
+                <w:rFonts w:eastAsia="Times New Roman"/>
+                <w:sz w:val="16"/>
+                <w:szCs w:val="16"/>
+                <w:lang w:val="en-GB" w:eastAsia="en-GB"/>
+              </w:rPr>
+              <w:t>00000, 0%</w:t>
             </w:r>
           </w:p>
         </w:tc>
@@ -2467,7 +2284,6 @@
               <w:bottom w:val="single" w:sz="4" w:space="0" w:color="auto"/>
               <w:right w:val="single" w:sz="4" w:space="0" w:color="auto"/>
             </w:tcBorders>
-            <w:shd w:val="clear" w:color="auto" w:fill="auto"/>
             <w:vAlign w:val="center"/>
             <w:hideMark/>
           </w:tcPr>
@@ -2508,7 +2324,6 @@
               <w:bottom w:val="single" w:sz="4" w:space="0" w:color="auto"/>
               <w:right w:val="single" w:sz="4" w:space="0" w:color="auto"/>
             </w:tcBorders>
-            <w:shd w:val="clear" w:color="auto" w:fill="auto"/>
             <w:vAlign w:val="center"/>
             <w:hideMark/>
           </w:tcPr>
@@ -2531,7 +2346,43 @@
                 <w:szCs w:val="16"/>
                 <w:lang w:val="en-GB" w:eastAsia="en-GB"/>
               </w:rPr>
-              <w:t>(b)  Rs.300001/- to 700000</w:t>
+              <w:t>(b)  Rs.</w:t>
+            </w:r>
+            <w:r>
+              <w:rPr>
+                <w:rFonts w:eastAsia="Times New Roman"/>
+                <w:sz w:val="16"/>
+                <w:szCs w:val="16"/>
+                <w:lang w:val="en-GB" w:eastAsia="en-GB"/>
+              </w:rPr>
+              <w:t>4</w:t>
+            </w:r>
+            <w:r>
+              <w:rPr>
+                <w:rFonts w:eastAsia="Times New Roman"/>
+                <w:sz w:val="16"/>
+                <w:szCs w:val="16"/>
+                <w:lang w:val="en-GB" w:eastAsia="en-GB"/>
+              </w:rPr>
+              <w:t xml:space="preserve">00001/- to </w:t>
+            </w:r>
+            <w:r>
+              <w:rPr>
+                <w:rFonts w:eastAsia="Times New Roman"/>
+                <w:sz w:val="16"/>
+                <w:szCs w:val="16"/>
+                <w:lang w:val="en-GB" w:eastAsia="en-GB"/>
+              </w:rPr>
+              <w:t>8</w:t>
+            </w:r>
+            <w:r>
+              <w:rPr>
+                <w:rFonts w:eastAsia="Times New Roman"/>
+                <w:sz w:val="16"/>
+                <w:szCs w:val="16"/>
+                <w:lang w:val="en-GB" w:eastAsia="en-GB"/>
+              </w:rPr>
+              <w:t>00000</w:t>
             </w:r>
             <w:proofErr w:type="gramStart"/>
             <w:r>
@@ -2564,7 +2415,6 @@
               <w:bottom w:val="single" w:sz="4" w:space="0" w:color="auto"/>
               <w:right w:val="single" w:sz="4" w:space="0" w:color="auto"/>
             </w:tcBorders>
-            <w:shd w:val="clear" w:color="auto" w:fill="auto"/>
             <w:vAlign w:val="center"/>
             <w:hideMark/>
           </w:tcPr>
@@ -2609,7 +2459,6 @@
               <w:bottom w:val="single" w:sz="4" w:space="0" w:color="auto"/>
               <w:right w:val="single" w:sz="4" w:space="0" w:color="auto"/>
             </w:tcBorders>
-            <w:shd w:val="clear" w:color="auto" w:fill="auto"/>
             <w:vAlign w:val="center"/>
             <w:hideMark/>
           </w:tcPr>
@@ -2632,7 +2481,43 @@
                 <w:szCs w:val="16"/>
                 <w:lang w:val="en-GB" w:eastAsia="en-GB"/>
               </w:rPr>
-              <w:t>(c)  Rs.700001/- to 1000000</w:t>
+              <w:t>(c)  Rs.</w:t>
+            </w:r>
+            <w:r>
+              <w:rPr>
+                <w:rFonts w:eastAsia="Times New Roman"/>
+                <w:sz w:val="16"/>
+                <w:szCs w:val="16"/>
+                <w:lang w:val="en-GB" w:eastAsia="en-GB"/>
+              </w:rPr>
+              <w:t>8</w:t>
+            </w:r>
+            <w:r>
+              <w:rPr>
+                <w:rFonts w:eastAsia="Times New Roman"/>
+                <w:sz w:val="16"/>
+                <w:szCs w:val="16"/>
+                <w:lang w:val="en-GB" w:eastAsia="en-GB"/>
+              </w:rPr>
+              <w:t>00001/- to 1</w:t>
+            </w:r>
+            <w:r>
+              <w:rPr>
+                <w:rFonts w:eastAsia="Times New Roman"/>
+                <w:sz w:val="16"/>
+                <w:szCs w:val="16"/>
+                <w:lang w:val="en-GB" w:eastAsia="en-GB"/>
+              </w:rPr>
+              <w:t>2</w:t>
+            </w:r>
+            <w:r>
+              <w:rPr>
+                <w:rFonts w:eastAsia="Times New Roman"/>
+                <w:sz w:val="16"/>
+                <w:szCs w:val="16"/>
+                <w:lang w:val="en-GB" w:eastAsia="en-GB"/>
+              </w:rPr>
+              <w:t>00000</w:t>
             </w:r>
             <w:proofErr w:type="gramStart"/>
             <w:r>
@@ -2665,7 +2550,6 @@
               <w:bottom w:val="single" w:sz="4" w:space="0" w:color="auto"/>
               <w:right w:val="single" w:sz="4" w:space="0" w:color="auto"/>
             </w:tcBorders>
-            <w:shd w:val="clear" w:color="auto" w:fill="auto"/>
             <w:vAlign w:val="bottom"/>
             <w:hideMark/>
           </w:tcPr>
@@ -2710,7 +2594,6 @@
               <w:bottom w:val="single" w:sz="4" w:space="0" w:color="auto"/>
               <w:right w:val="single" w:sz="4" w:space="0" w:color="auto"/>
             </w:tcBorders>
-            <w:shd w:val="clear" w:color="auto" w:fill="auto"/>
             <w:vAlign w:val="center"/>
             <w:hideMark/>
           </w:tcPr>
@@ -2733,7 +2616,43 @@
                 <w:szCs w:val="16"/>
                 <w:lang w:val="en-GB" w:eastAsia="en-GB"/>
               </w:rPr>
-              <w:t>(d)  Rs.1000001/- to 1200000</w:t>
+              <w:t>(d)  Rs.1</w:t>
+            </w:r>
+            <w:r>
+              <w:rPr>
+                <w:rFonts w:eastAsia="Times New Roman"/>
+                <w:sz w:val="16"/>
+                <w:szCs w:val="16"/>
+                <w:lang w:val="en-GB" w:eastAsia="en-GB"/>
+              </w:rPr>
+              <w:t>2</w:t>
+            </w:r>
+            <w:r>
+              <w:rPr>
+                <w:rFonts w:eastAsia="Times New Roman"/>
+                <w:sz w:val="16"/>
+                <w:szCs w:val="16"/>
+                <w:lang w:val="en-GB" w:eastAsia="en-GB"/>
+              </w:rPr>
+              <w:t>00001/- to 1</w:t>
+            </w:r>
+            <w:r>
+              <w:rPr>
+                <w:rFonts w:eastAsia="Times New Roman"/>
+                <w:sz w:val="16"/>
+                <w:szCs w:val="16"/>
+                <w:lang w:val="en-GB" w:eastAsia="en-GB"/>
+              </w:rPr>
+              <w:t>6</w:t>
+            </w:r>
+            <w:r>
+              <w:rPr>
+                <w:rFonts w:eastAsia="Times New Roman"/>
+                <w:sz w:val="16"/>
+                <w:szCs w:val="16"/>
+                <w:lang w:val="en-GB" w:eastAsia="en-GB"/>
+              </w:rPr>
+              <w:t>00000</w:t>
             </w:r>
             <w:proofErr w:type="gramStart"/>
             <w:r>
@@ -2766,7 +2685,6 @@
               <w:bottom w:val="single" w:sz="4" w:space="0" w:color="auto"/>
               <w:right w:val="single" w:sz="4" w:space="0" w:color="auto"/>
             </w:tcBorders>
-            <w:shd w:val="clear" w:color="auto" w:fill="auto"/>
             <w:vAlign w:val="bottom"/>
             <w:hideMark/>
           </w:tcPr>
@@ -2811,7 +2729,6 @@
               <w:bottom w:val="single" w:sz="4" w:space="0" w:color="auto"/>
               <w:right w:val="single" w:sz="4" w:space="0" w:color="auto"/>
             </w:tcBorders>
-            <w:shd w:val="clear" w:color="auto" w:fill="auto"/>
             <w:vAlign w:val="center"/>
             <w:hideMark/>
           </w:tcPr>
@@ -2834,7 +2751,43 @@
                 <w:szCs w:val="16"/>
                 <w:lang w:val="en-GB" w:eastAsia="en-GB"/>
               </w:rPr>
-              <w:t>(e)  RS.1200001/- to 1500000/ ,20%</w:t>
+              <w:t>(e)  RS.1</w:t>
+            </w:r>
+            <w:r>
+              <w:rPr>
+                <w:rFonts w:eastAsia="Times New Roman"/>
+                <w:sz w:val="16"/>
+                <w:szCs w:val="16"/>
+                <w:lang w:val="en-GB" w:eastAsia="en-GB"/>
+              </w:rPr>
+              <w:t>6</w:t>
+            </w:r>
+            <w:r>
+              <w:rPr>
+                <w:rFonts w:eastAsia="Times New Roman"/>
+                <w:sz w:val="16"/>
+                <w:szCs w:val="16"/>
+                <w:lang w:val="en-GB" w:eastAsia="en-GB"/>
+              </w:rPr>
+              <w:t xml:space="preserve">00001/- to </w:t>
+            </w:r>
+            <w:r>
+              <w:rPr>
+                <w:rFonts w:eastAsia="Times New Roman"/>
+                <w:sz w:val="16"/>
+                <w:szCs w:val="16"/>
+                <w:lang w:val="en-GB" w:eastAsia="en-GB"/>
+              </w:rPr>
+              <w:t>20</w:t>
+            </w:r>
+            <w:r>
+              <w:rPr>
+                <w:rFonts w:eastAsia="Times New Roman"/>
+                <w:sz w:val="16"/>
+                <w:szCs w:val="16"/>
+                <w:lang w:val="en-GB" w:eastAsia="en-GB"/>
+              </w:rPr>
+              <w:t>00000/ ,20%</w:t>
             </w:r>
           </w:p>
         </w:tc>
@@ -2847,7 +2800,6 @@
               <w:bottom w:val="single" w:sz="4" w:space="0" w:color="auto"/>
               <w:right w:val="single" w:sz="4" w:space="0" w:color="auto"/>
             </w:tcBorders>
-            <w:shd w:val="clear" w:color="auto" w:fill="auto"/>
             <w:vAlign w:val="bottom"/>
             <w:hideMark/>
           </w:tcPr>
@@ -2892,7 +2844,6 @@
               <w:bottom w:val="single" w:sz="4" w:space="0" w:color="auto"/>
               <w:right w:val="single" w:sz="4" w:space="0" w:color="auto"/>
             </w:tcBorders>
-            <w:shd w:val="clear" w:color="auto" w:fill="auto"/>
             <w:vAlign w:val="center"/>
             <w:hideMark/>
           </w:tcPr>
@@ -2915,7 +2866,34 @@
                 <w:szCs w:val="16"/>
                 <w:lang w:val="en-GB" w:eastAsia="en-GB"/>
               </w:rPr>
-              <w:t xml:space="preserve">(f)  Rs.1500001/- to above </w:t>
+              <w:t>(f)  Rs.</w:t>
+            </w:r>
+            <w:r>
+              <w:rPr>
+                <w:rFonts w:eastAsia="Times New Roman"/>
+                <w:sz w:val="16"/>
+                <w:szCs w:val="16"/>
+                <w:lang w:val="en-GB" w:eastAsia="en-GB"/>
+              </w:rPr>
+              <w:t>20</w:t>
+            </w:r>
+            <w:r>
+              <w:rPr>
+                <w:rFonts w:eastAsia="Times New Roman"/>
+                <w:sz w:val="16"/>
+                <w:szCs w:val="16"/>
+                <w:lang w:val="en-GB" w:eastAsia="en-GB"/>
+              </w:rPr>
+              <w:t xml:space="preserve">00001/- to </w:t>
+            </w:r>
+            <w:r>
+              <w:rPr>
+                <w:rFonts w:eastAsia="Times New Roman"/>
+                <w:sz w:val="16"/>
+                <w:szCs w:val="16"/>
+                <w:lang w:val="en-GB" w:eastAsia="en-GB"/>
+              </w:rPr>
+              <w:t>2400000</w:t>
             </w:r>
             <w:proofErr w:type="gramStart"/>
             <w:r>
@@ -2925,6 +2903,15 @@
                 <w:szCs w:val="16"/>
                 <w:lang w:val="en-GB" w:eastAsia="en-GB"/>
               </w:rPr>
+              <w:t>/</w:t>
+            </w:r>
+            <w:r>
+              <w:rPr>
+                <w:rFonts w:eastAsia="Times New Roman"/>
+                <w:sz w:val="16"/>
+                <w:szCs w:val="16"/>
+                <w:lang w:val="en-GB" w:eastAsia="en-GB"/>
+              </w:rPr>
               <w:t xml:space="preserve">  ,</w:t>
             </w:r>
             <w:proofErr w:type="gramEnd"/>
@@ -2935,7 +2922,25 @@
                 <w:szCs w:val="16"/>
                 <w:lang w:val="en-GB" w:eastAsia="en-GB"/>
               </w:rPr>
-              <w:t xml:space="preserve">  30%</w:t>
+              <w:t xml:space="preserve"> </w:t>
+            </w:r>
+            <w:r>
+              <w:rPr>
+                <w:rFonts w:eastAsia="Times New Roman"/>
+                <w:sz w:val="16"/>
+                <w:szCs w:val="16"/>
+                <w:lang w:val="en-GB" w:eastAsia="en-GB"/>
+              </w:rPr>
+              <w:t>25</w:t>
+            </w:r>
+            <w:r>
+              <w:rPr>
+                <w:rFonts w:eastAsia="Times New Roman"/>
+                <w:sz w:val="16"/>
+                <w:szCs w:val="16"/>
+                <w:lang w:val="en-GB" w:eastAsia="en-GB"/>
+              </w:rPr>
+              <w:t>%</w:t>
             </w:r>
           </w:p>
         </w:tc>
@@ -2948,7 +2953,6 @@
               <w:bottom w:val="single" w:sz="4" w:space="0" w:color="auto"/>
               <w:right w:val="single" w:sz="4" w:space="0" w:color="auto"/>
             </w:tcBorders>
-            <w:shd w:val="clear" w:color="auto" w:fill="auto"/>
             <w:vAlign w:val="bottom"/>
             <w:hideMark/>
           </w:tcPr>
@@ -2975,7 +2979,211 @@
                 <w:szCs w:val="16"/>
                 <w:lang w:val="en-GB" w:eastAsia="en-GB"/>
               </w:rPr>
-              <w:t>{{30per}}</w:t>
+              <w:t>{{</w:t>
+            </w:r>
+            <w:r>
+              <w:rPr>
+                <w:rFonts w:ascii="Arial" w:eastAsia="Times New Roman" w:hAnsi="Arial" w:cs="Arial"/>
+                <w:b/>
+                <w:bCs/>
+                <w:sz w:val="16"/>
+                <w:szCs w:val="16"/>
+                <w:lang w:val="en-GB" w:eastAsia="en-GB"/>
+              </w:rPr>
+              <w:t>25</w:t>
+            </w:r>
+            <w:r>
+              <w:rPr>
+                <w:rFonts w:ascii="Arial" w:eastAsia="Times New Roman" w:hAnsi="Arial" w:cs="Arial"/>
+                <w:b/>
+                <w:bCs/>
+                <w:sz w:val="16"/>
+                <w:szCs w:val="16"/>
+                <w:lang w:val="en-GB" w:eastAsia="en-GB"/>
+              </w:rPr>
+              <w:t>per}}</w:t>
+            </w:r>
+          </w:p>
+        </w:tc>
+      </w:tr>
+      <w:tr>
+        <w:trPr>
+          <w:trHeight w:val="308"/>
+        </w:trPr>
+        <w:tc>
+          <w:tcPr>
+            <w:tcW w:w="4239" w:type="dxa"/>
+            <w:tcBorders>
+              <w:top w:val="single" w:sz="4" w:space="0" w:color="auto"/>
+              <w:left w:val="single" w:sz="4" w:space="0" w:color="auto"/>
+              <w:bottom w:val="single" w:sz="4" w:space="0" w:color="auto"/>
+              <w:right w:val="single" w:sz="4" w:space="0" w:color="auto"/>
+            </w:tcBorders>
+            <w:vAlign w:val="center"/>
+          </w:tcPr>
+          <w:p>
+            <w:pPr>
+              <w:widowControl/>
+              <w:autoSpaceDE/>
+              <w:autoSpaceDN/>
+              <w:rPr>
+                <w:rFonts w:eastAsia="Times New Roman"/>
+                <w:sz w:val="16"/>
+                <w:szCs w:val="16"/>
+                <w:lang w:val="en-GB" w:eastAsia="en-GB"/>
+              </w:rPr>
+            </w:pPr>
+            <w:r>
+              <w:rPr>
+                <w:rFonts w:eastAsia="Times New Roman"/>
+                <w:sz w:val="16"/>
+                <w:szCs w:val="16"/>
+                <w:lang w:val="en-GB" w:eastAsia="en-GB"/>
+              </w:rPr>
+              <w:t>(f)  Rs.</w:t>
+            </w:r>
+            <w:r>
+              <w:rPr>
+                <w:rFonts w:eastAsia="Times New Roman"/>
+                <w:sz w:val="16"/>
+                <w:szCs w:val="16"/>
+                <w:lang w:val="en-GB" w:eastAsia="en-GB"/>
+              </w:rPr>
+              <w:t>2</w:t>
+            </w:r>
+            <w:r>
+              <w:rPr>
+                <w:rFonts w:eastAsia="Times New Roman"/>
+                <w:sz w:val="16"/>
+                <w:szCs w:val="16"/>
+                <w:lang w:val="en-GB" w:eastAsia="en-GB"/>
+              </w:rPr>
+              <w:t>4</w:t>
+            </w:r>
+            <w:r>
+              <w:rPr>
+                <w:rFonts w:eastAsia="Times New Roman"/>
+                <w:sz w:val="16"/>
+                <w:szCs w:val="16"/>
+                <w:lang w:val="en-GB" w:eastAsia="en-GB"/>
+              </w:rPr>
+              <w:t xml:space="preserve">00001/- </w:t>
+            </w:r>
+            <w:r>
+              <w:rPr>
+                <w:rFonts w:eastAsia="Times New Roman"/>
+                <w:sz w:val="16"/>
+                <w:szCs w:val="16"/>
+                <w:lang w:val="en-GB" w:eastAsia="en-GB"/>
+              </w:rPr>
+              <w:t xml:space="preserve">And </w:t>
+            </w:r>
+            <w:proofErr w:type="gramStart"/>
+            <w:r>
+              <w:rPr>
+                <w:rFonts w:eastAsia="Times New Roman"/>
+                <w:sz w:val="16"/>
+                <w:szCs w:val="16"/>
+                <w:lang w:val="en-GB" w:eastAsia="en-GB"/>
+              </w:rPr>
+              <w:t>Above</w:t>
+            </w:r>
+            <w:r>
+              <w:rPr>
+                <w:rFonts w:eastAsia="Times New Roman"/>
+                <w:sz w:val="16"/>
+                <w:szCs w:val="16"/>
+                <w:lang w:val="en-GB" w:eastAsia="en-GB"/>
+              </w:rPr>
+              <w:t xml:space="preserve">  ,</w:t>
+            </w:r>
+            <w:proofErr w:type="gramEnd"/>
+            <w:r>
+              <w:rPr>
+                <w:rFonts w:eastAsia="Times New Roman"/>
+                <w:sz w:val="16"/>
+                <w:szCs w:val="16"/>
+                <w:lang w:val="en-GB" w:eastAsia="en-GB"/>
+              </w:rPr>
+              <w:t xml:space="preserve"> </w:t>
+            </w:r>
+            <w:r>
+              <w:rPr>
+                <w:rFonts w:eastAsia="Times New Roman"/>
+                <w:sz w:val="16"/>
+                <w:szCs w:val="16"/>
+                <w:lang w:val="en-GB" w:eastAsia="en-GB"/>
+              </w:rPr>
+              <w:t>30</w:t>
+            </w:r>
+            <w:r>
+              <w:rPr>
+                <w:rFonts w:eastAsia="Times New Roman"/>
+                <w:sz w:val="16"/>
+                <w:szCs w:val="16"/>
+                <w:lang w:val="en-GB" w:eastAsia="en-GB"/>
+              </w:rPr>
+              <w:t>%</w:t>
+            </w:r>
+          </w:p>
+        </w:tc>
+        <w:tc>
+          <w:tcPr>
+            <w:tcW w:w="1555" w:type="dxa"/>
+            <w:tcBorders>
+              <w:top w:val="nil"/>
+              <w:left w:val="nil"/>
+              <w:bottom w:val="single" w:sz="4" w:space="0" w:color="auto"/>
+              <w:right w:val="single" w:sz="4" w:space="0" w:color="auto"/>
+            </w:tcBorders>
+            <w:vAlign w:val="bottom"/>
+          </w:tcPr>
+          <w:p>
+            <w:pPr>
+              <w:widowControl/>
+              <w:autoSpaceDE/>
+              <w:autoSpaceDN/>
+              <w:rPr>
+                <w:rFonts w:ascii="Arial" w:eastAsia="Times New Roman" w:hAnsi="Arial" w:cs="Arial"/>
+                <w:b/>
+                <w:bCs/>
+                <w:sz w:val="16"/>
+                <w:szCs w:val="16"/>
+                <w:lang w:val="en-GB" w:eastAsia="en-GB"/>
+              </w:rPr>
+            </w:pPr>
+            <w:r>
+              <w:rPr>
+                <w:rFonts w:ascii="Arial" w:eastAsia="Times New Roman" w:hAnsi="Arial" w:cs="Arial"/>
+                <w:b/>
+                <w:bCs/>
+                <w:sz w:val="16"/>
+                <w:szCs w:val="16"/>
+                <w:lang w:val="en-GB" w:eastAsia="en-GB"/>
+              </w:rPr>
+              <w:t>{{</w:t>
+            </w:r>
+            <w:r>
+              <w:rPr>
+                <w:rFonts w:ascii="Arial" w:eastAsia="Times New Roman" w:hAnsi="Arial" w:cs="Arial"/>
+                <w:b/>
+                <w:bCs/>
+                <w:sz w:val="16"/>
+                <w:szCs w:val="16"/>
+                <w:lang w:val="en-GB" w:eastAsia="en-GB"/>
+              </w:rPr>
+              <w:t>30</w:t>
+            </w:r>
+            <w:r>
+              <w:rPr>
+                <w:rFonts w:ascii="Arial" w:eastAsia="Times New Roman" w:hAnsi="Arial" w:cs="Arial"/>
+                <w:b/>
+                <w:bCs/>
+                <w:sz w:val="16"/>
+                <w:szCs w:val="16"/>
+                <w:lang w:val="en-GB" w:eastAsia="en-GB"/>
+              </w:rPr>
+              <w:t>per}}</w:t>
             </w:r>
           </w:p>
         </w:tc>
@@ -3569,7 +3777,17 @@
           <w:sz w:val="16"/>
           <w:szCs w:val="16"/>
         </w:rPr>
-        <w:t>200</w:t>
+        <w:t>6</w:t>
+      </w:r>
+      <w:r>
+        <w:rPr>
+          <w:rFonts w:asciiTheme="minorHAnsi" w:hAnsiTheme="minorHAnsi" w:cstheme="minorHAnsi"/>
+          <w:b/>
+          <w:bCs/>
+          <w:sz w:val="16"/>
+          <w:szCs w:val="16"/>
+        </w:rPr>
+        <w:t>00</w:t>
       </w:r>
       <w:r>
         <w:rPr>
@@ -3655,6 +3873,26 @@
         </w:rPr>
         <w:t xml:space="preserve"> </w:t>
       </w:r>
+      <w:r>
+        <w:rPr>
+          <w:rFonts w:asciiTheme="minorHAnsi" w:hAnsiTheme="minorHAnsi" w:cstheme="minorHAnsi"/>
+          <w:b/>
+          <w:bCs/>
+          <w:sz w:val="16"/>
+          <w:szCs w:val="16"/>
+        </w:rPr>
+        <w:t>NTI</w:t>
+      </w:r>
+      <w:r>
+        <w:rPr>
+          <w:rFonts w:asciiTheme="minorHAnsi" w:hAnsiTheme="minorHAnsi" w:cstheme="minorHAnsi"/>
+          <w:b/>
+          <w:bCs/>
+          <w:sz w:val="16"/>
+          <w:szCs w:val="16"/>
+        </w:rPr>
+        <w:t xml:space="preserve"> &lt;= 12 </w:t>
+      </w:r>
       <w:proofErr w:type="gramStart"/>
       <w:r>
         <w:rPr>
@@ -3664,7 +3902,7 @@
           <w:sz w:val="16"/>
           <w:szCs w:val="16"/>
         </w:rPr>
-        <w:t>NTI</w:t>
+        <w:t>lacs</w:t>
       </w:r>
       <w:r>
         <w:rPr>
@@ -3698,142 +3936,6 @@
           <w:szCs w:val="16"/>
         </w:rPr>
         <w:t xml:space="preserve"> </w:t>
-      </w:r>
-      <w:r>
-        <w:rPr>
-          <w:rFonts w:asciiTheme="minorHAnsi" w:hAnsiTheme="minorHAnsi" w:cstheme="minorHAnsi"/>
-          <w:b/>
-          <w:bCs/>
-          <w:sz w:val="16"/>
-          <w:szCs w:val="16"/>
-        </w:rPr>
-        <w:t>Taxable</w:t>
-      </w:r>
-      <w:r>
-        <w:rPr>
-          <w:rFonts w:asciiTheme="minorHAnsi" w:hAnsiTheme="minorHAnsi" w:cstheme="minorHAnsi"/>
-          <w:b/>
-          <w:bCs/>
-          <w:spacing w:val="-2"/>
-          <w:sz w:val="16"/>
-          <w:szCs w:val="16"/>
-        </w:rPr>
-        <w:t xml:space="preserve"> </w:t>
-      </w:r>
-      <w:r>
-        <w:rPr>
-          <w:rFonts w:asciiTheme="minorHAnsi" w:hAnsiTheme="minorHAnsi" w:cstheme="minorHAnsi"/>
-          <w:b/>
-          <w:bCs/>
-          <w:sz w:val="16"/>
-          <w:szCs w:val="16"/>
-        </w:rPr>
-        <w:t>Income</w:t>
-      </w:r>
-      <w:r>
-        <w:rPr>
-          <w:rFonts w:asciiTheme="minorHAnsi" w:hAnsiTheme="minorHAnsi" w:cstheme="minorHAnsi"/>
-          <w:b/>
-          <w:bCs/>
-          <w:spacing w:val="-3"/>
-          <w:sz w:val="16"/>
-          <w:szCs w:val="16"/>
-        </w:rPr>
-        <w:t xml:space="preserve"> </w:t>
-      </w:r>
-      <w:r>
-        <w:rPr>
-          <w:rFonts w:asciiTheme="minorHAnsi" w:hAnsiTheme="minorHAnsi" w:cstheme="minorHAnsi"/>
-          <w:b/>
-          <w:bCs/>
-          <w:sz w:val="16"/>
-          <w:szCs w:val="16"/>
-        </w:rPr>
-        <w:t>is</w:t>
-      </w:r>
-      <w:r>
-        <w:rPr>
-          <w:rFonts w:asciiTheme="minorHAnsi" w:hAnsiTheme="minorHAnsi" w:cstheme="minorHAnsi"/>
-          <w:b/>
-          <w:bCs/>
-          <w:spacing w:val="-2"/>
-          <w:sz w:val="16"/>
-          <w:szCs w:val="16"/>
-        </w:rPr>
-        <w:t xml:space="preserve"> </w:t>
-      </w:r>
-      <w:r>
-        <w:rPr>
-          <w:rFonts w:asciiTheme="minorHAnsi" w:hAnsiTheme="minorHAnsi" w:cstheme="minorHAnsi"/>
-          <w:b/>
-          <w:bCs/>
-          <w:sz w:val="16"/>
-          <w:szCs w:val="16"/>
-        </w:rPr>
-        <w:t>Rs.</w:t>
-      </w:r>
-      <w:r>
-        <w:rPr>
-          <w:rFonts w:asciiTheme="minorHAnsi" w:hAnsiTheme="minorHAnsi" w:cstheme="minorHAnsi"/>
-          <w:b/>
-          <w:bCs/>
-          <w:sz w:val="16"/>
-          <w:szCs w:val="16"/>
-        </w:rPr>
-        <w:t>7</w:t>
-      </w:r>
-      <w:r>
-        <w:rPr>
-          <w:rFonts w:asciiTheme="minorHAnsi" w:hAnsiTheme="minorHAnsi" w:cstheme="minorHAnsi"/>
-          <w:b/>
-          <w:bCs/>
-          <w:sz w:val="16"/>
-          <w:szCs w:val="16"/>
-        </w:rPr>
-        <w:t>00000/</w:t>
-      </w:r>
-      <w:r>
-        <w:rPr>
-          <w:rFonts w:asciiTheme="minorHAnsi" w:hAnsiTheme="minorHAnsi" w:cstheme="minorHAnsi"/>
-          <w:b/>
-          <w:bCs/>
-          <w:spacing w:val="-1"/>
-          <w:sz w:val="16"/>
-          <w:szCs w:val="16"/>
-        </w:rPr>
-        <w:t xml:space="preserve"> </w:t>
-      </w:r>
-      <w:r>
-        <w:rPr>
-          <w:rFonts w:asciiTheme="minorHAnsi" w:hAnsiTheme="minorHAnsi" w:cstheme="minorHAnsi"/>
-          <w:b/>
-          <w:bCs/>
-          <w:sz w:val="16"/>
-          <w:szCs w:val="16"/>
-        </w:rPr>
-        <w:t>or</w:t>
-      </w:r>
-      <w:r>
-        <w:rPr>
-          <w:rFonts w:asciiTheme="minorHAnsi" w:hAnsiTheme="minorHAnsi" w:cstheme="minorHAnsi"/>
-          <w:b/>
-          <w:bCs/>
-          <w:spacing w:val="-3"/>
-          <w:sz w:val="16"/>
-          <w:szCs w:val="16"/>
-        </w:rPr>
-        <w:t xml:space="preserve"> </w:t>
-      </w:r>
-      <w:r>
-        <w:rPr>
-          <w:rFonts w:asciiTheme="minorHAnsi" w:hAnsiTheme="minorHAnsi" w:cstheme="minorHAnsi"/>
-          <w:b/>
-          <w:bCs/>
-          <w:spacing w:val="-4"/>
-          <w:sz w:val="16"/>
-          <w:szCs w:val="16"/>
-        </w:rPr>
-        <w:t>Less</w:t>
       </w:r>
       <w:r>
         <w:rPr>
@@ -4785,6 +4887,30 @@
     </w:p>
     <w:p>
       <w:pPr>
+        <w:tabs>
+          <w:tab w:val="left" w:pos="893"/>
+        </w:tabs>
+        <w:rPr>
+          <w:rFonts w:asciiTheme="minorHAnsi" w:hAnsiTheme="minorHAnsi" w:cstheme="minorHAnsi"/>
+          <w:sz w:val="16"/>
+          <w:szCs w:val="16"/>
+        </w:rPr>
+      </w:pPr>
+    </w:p>
+    <w:p>
+      <w:pPr>
+        <w:tabs>
+          <w:tab w:val="left" w:pos="893"/>
+        </w:tabs>
+        <w:rPr>
+          <w:rFonts w:asciiTheme="minorHAnsi" w:hAnsiTheme="minorHAnsi" w:cstheme="minorHAnsi"/>
+          <w:sz w:val="16"/>
+          <w:szCs w:val="16"/>
+        </w:rPr>
+      </w:pPr>
+    </w:p>
+    <w:p>
+      <w:pPr>
         <w:jc w:val="center"/>
         <w:rPr>
           <w:rFonts w:asciiTheme="minorHAnsi" w:hAnsiTheme="minorHAnsi" w:cstheme="minorHAnsi"/>
@@ -4801,6 +4927,7 @@
           <w:sz w:val="16"/>
           <w:szCs w:val="16"/>
         </w:rPr>
+        <w:lastRenderedPageBreak/>
         <w:t>STATEMENT</w:t>
       </w:r>
       <w:r>
@@ -4964,7 +5091,16 @@
                 <w:sz w:val="16"/>
                 <w:szCs w:val="16"/>
               </w:rPr>
-              <w:t>1. April-2024</w:t>
+              <w:t>1. April-202</w:t>
+            </w:r>
+            <w:r>
+              <w:rPr>
+                <w:rFonts w:asciiTheme="minorHAnsi" w:hAnsiTheme="minorHAnsi" w:cstheme="minorHAnsi"/>
+                <w:bCs/>
+                <w:sz w:val="16"/>
+                <w:szCs w:val="16"/>
+              </w:rPr>
+              <w:t>5</w:t>
             </w:r>
           </w:p>
         </w:tc>
@@ -5068,7 +5204,16 @@
                 <w:sz w:val="16"/>
                 <w:szCs w:val="16"/>
               </w:rPr>
-              <w:t>2. May-2024</w:t>
+              <w:t>2. May-202</w:t>
+            </w:r>
+            <w:r>
+              <w:rPr>
+                <w:rFonts w:asciiTheme="minorHAnsi" w:hAnsiTheme="minorHAnsi" w:cstheme="minorHAnsi"/>
+                <w:bCs/>
+                <w:sz w:val="16"/>
+                <w:szCs w:val="16"/>
+              </w:rPr>
+              <w:t>5</w:t>
             </w:r>
           </w:p>
         </w:tc>
@@ -5152,7 +5297,16 @@
                 <w:sz w:val="16"/>
                 <w:szCs w:val="16"/>
               </w:rPr>
-              <w:t>3. June-2024</w:t>
+              <w:t>3. June-202</w:t>
+            </w:r>
+            <w:r>
+              <w:rPr>
+                <w:rFonts w:asciiTheme="minorHAnsi" w:hAnsiTheme="minorHAnsi" w:cstheme="minorHAnsi"/>
+                <w:bCs/>
+                <w:sz w:val="16"/>
+                <w:szCs w:val="16"/>
+              </w:rPr>
+              <w:t>5</w:t>
             </w:r>
           </w:p>
         </w:tc>
@@ -5240,7 +5394,16 @@
                 <w:sz w:val="16"/>
                 <w:szCs w:val="16"/>
               </w:rPr>
-              <w:t>4. July-2024</w:t>
+              <w:t>4. July-202</w:t>
+            </w:r>
+            <w:r>
+              <w:rPr>
+                <w:rFonts w:asciiTheme="minorHAnsi" w:hAnsiTheme="minorHAnsi" w:cstheme="minorHAnsi"/>
+                <w:bCs/>
+                <w:sz w:val="16"/>
+                <w:szCs w:val="16"/>
+              </w:rPr>
+              <w:t>5</w:t>
             </w:r>
           </w:p>
         </w:tc>
@@ -5343,7 +5506,16 @@
                 <w:sz w:val="16"/>
                 <w:szCs w:val="16"/>
               </w:rPr>
-              <w:t>5. Aug-2024</w:t>
+              <w:t>5. Aug-202</w:t>
+            </w:r>
+            <w:r>
+              <w:rPr>
+                <w:rFonts w:asciiTheme="minorHAnsi" w:hAnsiTheme="minorHAnsi" w:cstheme="minorHAnsi"/>
+                <w:bCs/>
+                <w:sz w:val="16"/>
+                <w:szCs w:val="16"/>
+              </w:rPr>
+              <w:t>5</w:t>
             </w:r>
           </w:p>
         </w:tc>
@@ -5447,7 +5619,16 @@
                 <w:sz w:val="16"/>
                 <w:szCs w:val="16"/>
               </w:rPr>
-              <w:t>6. Sep-2024</w:t>
+              <w:t>6. Sep-202</w:t>
+            </w:r>
+            <w:r>
+              <w:rPr>
+                <w:rFonts w:asciiTheme="minorHAnsi" w:hAnsiTheme="minorHAnsi" w:cstheme="minorHAnsi"/>
+                <w:bCs/>
+                <w:sz w:val="16"/>
+                <w:szCs w:val="16"/>
+              </w:rPr>
+              <w:t>5</w:t>
             </w:r>
           </w:p>
         </w:tc>
@@ -5535,7 +5716,16 @@
                 <w:sz w:val="16"/>
                 <w:szCs w:val="16"/>
               </w:rPr>
-              <w:t>7. Oct-2024</w:t>
+              <w:t>7. Oct-202</w:t>
+            </w:r>
+            <w:r>
+              <w:rPr>
+                <w:rFonts w:asciiTheme="minorHAnsi" w:hAnsiTheme="minorHAnsi" w:cstheme="minorHAnsi"/>
+                <w:bCs/>
+                <w:sz w:val="16"/>
+                <w:szCs w:val="16"/>
+              </w:rPr>
+              <w:t>5</w:t>
             </w:r>
           </w:p>
         </w:tc>
@@ -5618,7 +5808,16 @@
                 <w:sz w:val="16"/>
                 <w:szCs w:val="16"/>
               </w:rPr>
-              <w:t>8. Nov-2024</w:t>
+              <w:t>8. Nov-202</w:t>
+            </w:r>
+            <w:r>
+              <w:rPr>
+                <w:rFonts w:asciiTheme="minorHAnsi" w:hAnsiTheme="minorHAnsi" w:cstheme="minorHAnsi"/>
+                <w:bCs/>
+                <w:sz w:val="16"/>
+                <w:szCs w:val="16"/>
+              </w:rPr>
+              <w:t>5</w:t>
             </w:r>
           </w:p>
         </w:tc>
@@ -5722,7 +5921,16 @@
                 <w:sz w:val="16"/>
                 <w:szCs w:val="16"/>
               </w:rPr>
-              <w:t>9. Dec-2024</w:t>
+              <w:t>9. Dec-202</w:t>
+            </w:r>
+            <w:r>
+              <w:rPr>
+                <w:rFonts w:asciiTheme="minorHAnsi" w:hAnsiTheme="minorHAnsi" w:cstheme="minorHAnsi"/>
+                <w:bCs/>
+                <w:sz w:val="16"/>
+                <w:szCs w:val="16"/>
+              </w:rPr>
+              <w:t>5</w:t>
             </w:r>
           </w:p>
         </w:tc>
@@ -5790,7 +5998,16 @@
                 <w:sz w:val="16"/>
                 <w:szCs w:val="16"/>
               </w:rPr>
-              <w:t>10. Jan-2025</w:t>
+              <w:t>10. Jan-202</w:t>
+            </w:r>
+            <w:r>
+              <w:rPr>
+                <w:rFonts w:asciiTheme="minorHAnsi" w:hAnsiTheme="minorHAnsi" w:cstheme="minorHAnsi"/>
+                <w:bCs/>
+                <w:sz w:val="16"/>
+                <w:szCs w:val="16"/>
+              </w:rPr>
+              <w:t>6</w:t>
             </w:r>
           </w:p>
         </w:tc>
@@ -5893,7 +6110,16 @@
                 <w:sz w:val="16"/>
                 <w:szCs w:val="16"/>
               </w:rPr>
-              <w:t>11. Feb-2025</w:t>
+              <w:t>11. Feb-202</w:t>
+            </w:r>
+            <w:r>
+              <w:rPr>
+                <w:rFonts w:asciiTheme="minorHAnsi" w:hAnsiTheme="minorHAnsi" w:cstheme="minorHAnsi"/>
+                <w:bCs/>
+                <w:sz w:val="16"/>
+                <w:szCs w:val="16"/>
+              </w:rPr>
+              <w:t>6</w:t>
             </w:r>
           </w:p>
         </w:tc>
@@ -5910,7 +6136,6 @@
           <w:p>
             <w:pPr>
               <w:ind w:left="215"/>
-              <w:jc w:val="center"/>
               <w:rPr>
                 <w:rFonts w:asciiTheme="minorHAnsi" w:hAnsiTheme="minorHAnsi" w:cstheme="minorHAnsi"/>
                 <w:b/>
@@ -5918,6 +6143,15 @@
                 <w:szCs w:val="16"/>
               </w:rPr>
             </w:pPr>
+            <w:r>
+              <w:rPr>
+                <w:rFonts w:asciiTheme="minorHAnsi" w:hAnsiTheme="minorHAnsi" w:cstheme="minorHAnsi"/>
+                <w:b/>
+                <w:sz w:val="16"/>
+                <w:szCs w:val="16"/>
+              </w:rPr>
+              <w:t xml:space="preserve">    </w:t>
+            </w:r>
             <w:r>
               <w:rPr>
                 <w:rFonts w:asciiTheme="minorHAnsi" w:hAnsiTheme="minorHAnsi" w:cstheme="minorHAnsi"/>
@@ -5997,7 +6231,16 @@
                 <w:sz w:val="16"/>
                 <w:szCs w:val="16"/>
               </w:rPr>
-              <w:t>12. Mar-2025</w:t>
+              <w:t>12. Mar-202</w:t>
+            </w:r>
+            <w:r>
+              <w:rPr>
+                <w:rFonts w:asciiTheme="minorHAnsi" w:hAnsiTheme="minorHAnsi" w:cstheme="minorHAnsi"/>
+                <w:bCs/>
+                <w:sz w:val="16"/>
+                <w:szCs w:val="16"/>
+              </w:rPr>
+              <w:t>6</w:t>
             </w:r>
           </w:p>
         </w:tc>
@@ -6308,7 +6551,17 @@
           <w:sz w:val="16"/>
           <w:szCs w:val="16"/>
         </w:rPr>
-        <w:t>{name}}</w:t>
+        <w:t>{name</w:t>
+      </w:r>
+      <w:proofErr w:type="gramStart"/>
+      <w:r>
+        <w:rPr>
+          <w:rFonts w:asciiTheme="minorHAnsi" w:hAnsiTheme="minorHAnsi" w:cstheme="minorHAnsi"/>
+          <w:b/>
+          <w:sz w:val="16"/>
+          <w:szCs w:val="16"/>
+        </w:rPr>
+        <w:t>}}</w:t>
       </w:r>
       <w:r>
         <w:rPr>
@@ -6328,6 +6581,7 @@
         </w:rPr>
         <w:t>Designation</w:t>
       </w:r>
+      <w:proofErr w:type="gramEnd"/>
       <w:r>
         <w:rPr>
           <w:rFonts w:asciiTheme="minorHAnsi" w:hAnsiTheme="minorHAnsi" w:cstheme="minorHAnsi"/>
@@ -6344,7 +6598,17 @@
           <w:sz w:val="16"/>
           <w:szCs w:val="16"/>
         </w:rPr>
-        <w:t xml:space="preserve">{{designation}}  </w:t>
+        <w:t>{{designation</w:t>
+      </w:r>
+      <w:proofErr w:type="gramStart"/>
+      <w:r>
+        <w:rPr>
+          <w:rFonts w:asciiTheme="minorHAnsi" w:hAnsiTheme="minorHAnsi" w:cstheme="minorHAnsi"/>
+          <w:b/>
+          <w:sz w:val="16"/>
+          <w:szCs w:val="16"/>
+        </w:rPr>
+        <w:t xml:space="preserve">}}  </w:t>
       </w:r>
       <w:r>
         <w:rPr>
@@ -6354,6 +6618,7 @@
         </w:rPr>
         <w:t>In</w:t>
       </w:r>
+      <w:proofErr w:type="gramEnd"/>
       <w:r>
         <w:rPr>
           <w:rFonts w:asciiTheme="minorHAnsi" w:hAnsiTheme="minorHAnsi" w:cstheme="minorHAnsi"/>
@@ -6401,6 +6666,7 @@
         </w:rPr>
         <w:t xml:space="preserve"> </w:t>
       </w:r>
+      <w:proofErr w:type="gramStart"/>
       <w:r>
         <w:rPr>
           <w:rFonts w:asciiTheme="minorHAnsi" w:hAnsiTheme="minorHAnsi" w:cstheme="minorHAnsi"/>
@@ -6427,7 +6693,17 @@
           <w:sz w:val="16"/>
           <w:szCs w:val="16"/>
         </w:rPr>
-        <w:t xml:space="preserve"> hereby </w:t>
+        <w:t xml:space="preserve"> hereby</w:t>
+      </w:r>
+      <w:proofErr w:type="gramEnd"/>
+      <w:r>
+        <w:rPr>
+          <w:rFonts w:asciiTheme="minorHAnsi" w:hAnsiTheme="minorHAnsi" w:cstheme="minorHAnsi"/>
+          <w:spacing w:val="-2"/>
+          <w:sz w:val="16"/>
+          <w:szCs w:val="16"/>
+        </w:rPr>
+        <w:t xml:space="preserve"> </w:t>
       </w:r>
       <w:r>
         <w:rPr>
@@ -6446,13 +6722,23 @@
         </w:rPr>
         <w:t xml:space="preserve"> </w:t>
       </w:r>
-      <w:r>
-        <w:rPr>
-          <w:rFonts w:asciiTheme="minorHAnsi" w:hAnsiTheme="minorHAnsi" w:cstheme="minorHAnsi"/>
-          <w:sz w:val="16"/>
-          <w:szCs w:val="16"/>
-        </w:rPr>
-        <w:t>that.(a)</w:t>
+      <w:proofErr w:type="gramStart"/>
+      <w:r>
+        <w:rPr>
+          <w:rFonts w:asciiTheme="minorHAnsi" w:hAnsiTheme="minorHAnsi" w:cstheme="minorHAnsi"/>
+          <w:sz w:val="16"/>
+          <w:szCs w:val="16"/>
+        </w:rPr>
+        <w:t>that.(</w:t>
+      </w:r>
+      <w:proofErr w:type="gramEnd"/>
+      <w:r>
+        <w:rPr>
+          <w:rFonts w:asciiTheme="minorHAnsi" w:hAnsiTheme="minorHAnsi" w:cstheme="minorHAnsi"/>
+          <w:sz w:val="16"/>
+          <w:szCs w:val="16"/>
+        </w:rPr>
+        <w:t>a)</w:t>
       </w:r>
       <w:r>
         <w:rPr>
@@ -6650,13 +6936,23 @@
         </w:rPr>
         <w:t xml:space="preserve"> </w:t>
       </w:r>
-      <w:r>
-        <w:rPr>
-          <w:rFonts w:asciiTheme="minorHAnsi" w:hAnsiTheme="minorHAnsi" w:cstheme="minorHAnsi"/>
-          <w:sz w:val="16"/>
-          <w:szCs w:val="16"/>
-        </w:rPr>
-        <w:t>knowledge.(b)</w:t>
+      <w:proofErr w:type="gramStart"/>
+      <w:r>
+        <w:rPr>
+          <w:rFonts w:asciiTheme="minorHAnsi" w:hAnsiTheme="minorHAnsi" w:cstheme="minorHAnsi"/>
+          <w:sz w:val="16"/>
+          <w:szCs w:val="16"/>
+        </w:rPr>
+        <w:t>knowledge.(</w:t>
+      </w:r>
+      <w:proofErr w:type="gramEnd"/>
+      <w:r>
+        <w:rPr>
+          <w:rFonts w:asciiTheme="minorHAnsi" w:hAnsiTheme="minorHAnsi" w:cstheme="minorHAnsi"/>
+          <w:sz w:val="16"/>
+          <w:szCs w:val="16"/>
+        </w:rPr>
+        <w:t>b)</w:t>
       </w:r>
       <w:r>
         <w:rPr>
@@ -7096,16 +7392,35 @@
           <w:sz w:val="16"/>
           <w:szCs w:val="16"/>
         </w:rPr>
-        <w:t xml:space="preserve">                                                                                                                                                   </w:t>
-      </w:r>
-      <w:r>
-        <w:rPr>
-          <w:rFonts w:asciiTheme="minorHAnsi" w:hAnsiTheme="minorHAnsi" w:cstheme="minorHAnsi"/>
-          <w:b/>
-          <w:sz w:val="16"/>
-          <w:szCs w:val="16"/>
-        </w:rPr>
-        <w:t>{{na</w:t>
+        <w:t xml:space="preserve">                                                                                                                                                </w:t>
+      </w:r>
+      <w:proofErr w:type="gramStart"/>
+      <w:r>
+        <w:rPr>
+          <w:rFonts w:asciiTheme="minorHAnsi" w:hAnsiTheme="minorHAnsi" w:cstheme="minorHAnsi"/>
+          <w:sz w:val="16"/>
+          <w:szCs w:val="16"/>
+        </w:rPr>
+        <w:t xml:space="preserve">   </w:t>
+      </w:r>
+      <w:r>
+        <w:rPr>
+          <w:rFonts w:asciiTheme="minorHAnsi" w:hAnsiTheme="minorHAnsi" w:cstheme="minorHAnsi"/>
+          <w:b/>
+          <w:sz w:val="16"/>
+          <w:szCs w:val="16"/>
+        </w:rPr>
+        <w:t>{</w:t>
+      </w:r>
+      <w:proofErr w:type="gramEnd"/>
+      <w:r>
+        <w:rPr>
+          <w:rFonts w:asciiTheme="minorHAnsi" w:hAnsiTheme="minorHAnsi" w:cstheme="minorHAnsi"/>
+          <w:b/>
+          <w:sz w:val="16"/>
+          <w:szCs w:val="16"/>
+        </w:rPr>
+        <w:t>{na</w:t>
       </w:r>
       <w:r>
         <w:rPr>

</xml_diff>